<commit_message>
docs(guide): reword the product entry in the glossary
</commit_message>
<xml_diff>
--- a/docs/model-file-io-guide.docx
+++ b/docs/model-file-io-guide.docx
@@ -2028,7 +2028,7 @@
                 <w:color w:val="241B17"/>
                 <w:sz w:val="19"/>
               </w:rPr>
-              <w:t xml:space="preserve">需要交付给平台的输出文件，位于 </w:t>
+              <w:t xml:space="preserve">需要导出的输出文件，位于 </w:t>
             </w:r>
             <w:r>
               <w:rPr>
@@ -2048,7 +2048,7 @@
                 <w:color w:val="241B17"/>
                 <w:sz w:val="19"/>
               </w:rPr>
-              <w:t>，任务结束后被导出</w:t>
+              <w:t>，任务结束后统一导出</w:t>
             </w:r>
           </w:p>
         </w:tc>

</xml_diff>

<commit_message>
docs(guide): name the log and progress files in the layout table
</commit_message>
<xml_diff>
--- a/docs/model-file-io-guide.docx
+++ b/docs/model-file-io-guide.docx
@@ -2552,7 +2552,7 @@
                 <w:color w:val="241B17"/>
                 <w:sz w:val="19"/>
               </w:rPr>
-              <w:t>旁路 · 不导出</w:t>
+              <w:t>旁路 · 不导出 · 平台据此展示训练过程</w:t>
             </w:r>
           </w:p>
         </w:tc>
@@ -2577,7 +2577,7 @@
                 <w:color w:val="A8261B"/>
                 <w:sz w:val="17"/>
               </w:rPr>
-              <w:t xml:space="preserve">    └── progress/</w:t>
+              <w:t xml:space="preserve">    │   └── train.jsonl</w:t>
             </w:r>
           </w:p>
         </w:tc>
@@ -2597,7 +2597,97 @@
                 <w:color w:val="241B17"/>
                 <w:sz w:val="19"/>
               </w:rPr>
-              <w:t>旁路 · 不导出</w:t>
+              <w:t>每行一条 JSON 日志，可拆成多个文件</w:t>
+            </w:r>
+          </w:p>
+        </w:tc>
+      </w:tr>
+      <w:tr>
+        <w:trPr>
+          <w:cantSplit w:val="true"/>
+        </w:trPr>
+        <w:tc>
+          <w:tcPr>
+            <w:tcW w:type="dxa" w:w="4762"/>
+          </w:tcPr>
+          <w:p>
+            <w:pPr>
+              <w:spacing w:before="0" w:after="0" w:line="312" w:lineRule="auto"/>
+            </w:pPr>
+            <w:r>
+              <w:rPr>
+                <w:rFonts w:ascii="Consolas" w:hAnsi="Consolas" w:eastAsia="宋体" w:cs="Consolas"/>
+                <w:b w:val="0"/>
+                <w:i w:val="0"/>
+                <w:color w:val="A8261B"/>
+                <w:sz w:val="17"/>
+              </w:rPr>
+              <w:t xml:space="preserve">    └── progress/</w:t>
+            </w:r>
+          </w:p>
+        </w:tc>
+        <w:tc>
+          <w:tcPr>
+            <w:tcW w:type="dxa" w:w="4422"/>
+          </w:tcPr>
+          <w:p>
+            <w:pPr>
+              <w:spacing w:before="0" w:after="0" w:line="312" w:lineRule="auto"/>
+            </w:pPr>
+            <w:r>
+              <w:rPr>
+                <w:rFonts w:ascii="Calibri" w:hAnsi="Calibri" w:eastAsia="宋体" w:cs="Calibri"/>
+                <w:b w:val="0"/>
+                <w:i w:val="0"/>
+                <w:color w:val="241B17"/>
+                <w:sz w:val="19"/>
+              </w:rPr>
+              <w:t>旁路 · 不导出 · 平台据此显示进度条</w:t>
+            </w:r>
+          </w:p>
+        </w:tc>
+      </w:tr>
+      <w:tr>
+        <w:trPr>
+          <w:cantSplit w:val="true"/>
+        </w:trPr>
+        <w:tc>
+          <w:tcPr>
+            <w:tcW w:type="dxa" w:w="4762"/>
+          </w:tcPr>
+          <w:p>
+            <w:pPr>
+              <w:spacing w:before="0" w:after="0" w:line="312" w:lineRule="auto"/>
+            </w:pPr>
+            <w:r>
+              <w:rPr>
+                <w:rFonts w:ascii="Consolas" w:hAnsi="Consolas" w:eastAsia="宋体" w:cs="Consolas"/>
+                <w:b w:val="0"/>
+                <w:i w:val="0"/>
+                <w:color w:val="A8261B"/>
+                <w:sz w:val="17"/>
+              </w:rPr>
+              <w:t xml:space="preserve">        └── progress.json</w:t>
+            </w:r>
+          </w:p>
+        </w:tc>
+        <w:tc>
+          <w:tcPr>
+            <w:tcW w:type="dxa" w:w="4422"/>
+          </w:tcPr>
+          <w:p>
+            <w:pPr>
+              <w:spacing w:before="0" w:after="0" w:line="312" w:lineRule="auto"/>
+            </w:pPr>
+            <w:r>
+              <w:rPr>
+                <w:rFonts w:ascii="Calibri" w:hAnsi="Calibri" w:eastAsia="宋体" w:cs="Calibri"/>
+                <w:b w:val="0"/>
+                <w:i w:val="0"/>
+                <w:color w:val="241B17"/>
+                <w:sz w:val="19"/>
+              </w:rPr>
+              <w:t>文件名固定，进度写在其中</w:t>
             </w:r>
           </w:p>
         </w:tc>

</xml_diff>

<commit_message>
docs(guide): use absolute paths in the directory lifecycle table
</commit_message>
<xml_diff>
--- a/docs/model-file-io-guide.docx
+++ b/docs/model-file-io-guide.docx
@@ -2907,7 +2907,7 @@
         </w:trPr>
         <w:tc>
           <w:tcPr>
-            <w:tcW w:type="dxa" w:w="2098"/>
+            <w:tcW w:type="dxa" w:w="2835"/>
             <w:shd w:val="clear" w:color="auto" w:fill="FBEDE5"/>
           </w:tcPr>
           <w:p>
@@ -2928,7 +2928,7 @@
         </w:tc>
         <w:tc>
           <w:tcPr>
-            <w:tcW w:type="dxa" w:w="2608"/>
+            <w:tcW w:type="dxa" w:w="2268"/>
             <w:shd w:val="clear" w:color="auto" w:fill="FBEDE5"/>
           </w:tcPr>
           <w:p>
@@ -2949,7 +2949,7 @@
         </w:tc>
         <w:tc>
           <w:tcPr>
-            <w:tcW w:type="dxa" w:w="1247"/>
+            <w:tcW w:type="dxa" w:w="1134"/>
             <w:shd w:val="clear" w:color="auto" w:fill="FBEDE5"/>
           </w:tcPr>
           <w:p>
@@ -2970,7 +2970,7 @@
         </w:tc>
         <w:tc>
           <w:tcPr>
-            <w:tcW w:type="dxa" w:w="3231"/>
+            <w:tcW w:type="dxa" w:w="2948"/>
             <w:shd w:val="clear" w:color="auto" w:fill="FBEDE5"/>
           </w:tcPr>
           <w:p>
@@ -2996,7 +2996,7 @@
         </w:trPr>
         <w:tc>
           <w:tcPr>
-            <w:tcW w:type="dxa" w:w="2098"/>
+            <w:tcW w:type="dxa" w:w="2835"/>
           </w:tcPr>
           <w:p>
             <w:pPr>
@@ -3010,13 +3010,13 @@
                 <w:color w:val="A8261B"/>
                 <w:sz w:val="17"/>
               </w:rPr>
-              <w:t>input/</w:t>
+              <w:t>/opt/taa/input/</w:t>
             </w:r>
           </w:p>
         </w:tc>
         <w:tc>
           <w:tcPr>
-            <w:tcW w:type="dxa" w:w="2608"/>
+            <w:tcW w:type="dxa" w:w="2268"/>
           </w:tcPr>
           <w:p>
             <w:pPr>
@@ -3036,7 +3036,7 @@
         </w:tc>
         <w:tc>
           <w:tcPr>
-            <w:tcW w:type="dxa" w:w="1247"/>
+            <w:tcW w:type="dxa" w:w="1134"/>
           </w:tcPr>
           <w:p>
             <w:pPr>
@@ -3056,7 +3056,7 @@
         </w:tc>
         <w:tc>
           <w:tcPr>
-            <w:tcW w:type="dxa" w:w="3231"/>
+            <w:tcW w:type="dxa" w:w="2948"/>
           </w:tcPr>
           <w:p>
             <w:pPr>
@@ -3081,7 +3081,7 @@
         </w:trPr>
         <w:tc>
           <w:tcPr>
-            <w:tcW w:type="dxa" w:w="2098"/>
+            <w:tcW w:type="dxa" w:w="2835"/>
           </w:tcPr>
           <w:p>
             <w:pPr>
@@ -3095,13 +3095,13 @@
                 <w:color w:val="A8261B"/>
                 <w:sz w:val="17"/>
               </w:rPr>
-              <w:t>output/result/</w:t>
+              <w:t>/opt/taa/output/result/</w:t>
             </w:r>
           </w:p>
         </w:tc>
         <w:tc>
           <w:tcPr>
-            <w:tcW w:type="dxa" w:w="2608"/>
+            <w:tcW w:type="dxa" w:w="2268"/>
           </w:tcPr>
           <w:p>
             <w:pPr>
@@ -3121,7 +3121,7 @@
         </w:tc>
         <w:tc>
           <w:tcPr>
-            <w:tcW w:type="dxa" w:w="1247"/>
+            <w:tcW w:type="dxa" w:w="1134"/>
           </w:tcPr>
           <w:p>
             <w:pPr>
@@ -3141,7 +3141,7 @@
         </w:tc>
         <w:tc>
           <w:tcPr>
-            <w:tcW w:type="dxa" w:w="3231"/>
+            <w:tcW w:type="dxa" w:w="2948"/>
           </w:tcPr>
           <w:p>
             <w:pPr>
@@ -3166,7 +3166,7 @@
         </w:trPr>
         <w:tc>
           <w:tcPr>
-            <w:tcW w:type="dxa" w:w="2098"/>
+            <w:tcW w:type="dxa" w:w="2835"/>
           </w:tcPr>
           <w:p>
             <w:pPr>
@@ -3180,13 +3180,13 @@
                 <w:color w:val="A8261B"/>
                 <w:sz w:val="17"/>
               </w:rPr>
-              <w:t>output/log/</w:t>
+              <w:t>/opt/taa/output/log/</w:t>
             </w:r>
           </w:p>
         </w:tc>
         <w:tc>
           <w:tcPr>
-            <w:tcW w:type="dxa" w:w="2608"/>
+            <w:tcW w:type="dxa" w:w="2268"/>
           </w:tcPr>
           <w:p>
             <w:pPr>
@@ -3206,7 +3206,7 @@
         </w:tc>
         <w:tc>
           <w:tcPr>
-            <w:tcW w:type="dxa" w:w="1247"/>
+            <w:tcW w:type="dxa" w:w="1134"/>
           </w:tcPr>
           <w:p>
             <w:pPr>
@@ -3226,7 +3226,7 @@
         </w:tc>
         <w:tc>
           <w:tcPr>
-            <w:tcW w:type="dxa" w:w="3231"/>
+            <w:tcW w:type="dxa" w:w="2948"/>
           </w:tcPr>
           <w:p>
             <w:pPr>
@@ -3251,7 +3251,7 @@
         </w:trPr>
         <w:tc>
           <w:tcPr>
-            <w:tcW w:type="dxa" w:w="2098"/>
+            <w:tcW w:type="dxa" w:w="2835"/>
           </w:tcPr>
           <w:p>
             <w:pPr>
@@ -3265,13 +3265,13 @@
                 <w:color w:val="A8261B"/>
                 <w:sz w:val="17"/>
               </w:rPr>
-              <w:t>output/progress/</w:t>
+              <w:t>/opt/taa/output/progress/</w:t>
             </w:r>
           </w:p>
         </w:tc>
         <w:tc>
           <w:tcPr>
-            <w:tcW w:type="dxa" w:w="2608"/>
+            <w:tcW w:type="dxa" w:w="2268"/>
           </w:tcPr>
           <w:p>
             <w:pPr>
@@ -3291,7 +3291,7 @@
         </w:tc>
         <w:tc>
           <w:tcPr>
-            <w:tcW w:type="dxa" w:w="1247"/>
+            <w:tcW w:type="dxa" w:w="1134"/>
           </w:tcPr>
           <w:p>
             <w:pPr>
@@ -3311,7 +3311,7 @@
         </w:tc>
         <w:tc>
           <w:tcPr>
-            <w:tcW w:type="dxa" w:w="3231"/>
+            <w:tcW w:type="dxa" w:w="2948"/>
           </w:tcPr>
           <w:p>
             <w:pPr>
@@ -3336,7 +3336,7 @@
         </w:trPr>
         <w:tc>
           <w:tcPr>
-            <w:tcW w:type="dxa" w:w="2098"/>
+            <w:tcW w:type="dxa" w:w="2835"/>
           </w:tcPr>
           <w:p>
             <w:pPr>
@@ -3350,13 +3350,13 @@
                 <w:color w:val="A8261B"/>
                 <w:sz w:val="17"/>
               </w:rPr>
-              <w:t>models/</w:t>
+              <w:t>/opt/taa/models/</w:t>
             </w:r>
           </w:p>
         </w:tc>
         <w:tc>
           <w:tcPr>
-            <w:tcW w:type="dxa" w:w="2608"/>
+            <w:tcW w:type="dxa" w:w="2268"/>
           </w:tcPr>
           <w:p>
             <w:pPr>
@@ -3376,7 +3376,7 @@
         </w:tc>
         <w:tc>
           <w:tcPr>
-            <w:tcW w:type="dxa" w:w="1247"/>
+            <w:tcW w:type="dxa" w:w="1134"/>
           </w:tcPr>
           <w:p>
             <w:pPr>
@@ -3396,7 +3396,7 @@
         </w:tc>
         <w:tc>
           <w:tcPr>
-            <w:tcW w:type="dxa" w:w="3231"/>
+            <w:tcW w:type="dxa" w:w="2948"/>
           </w:tcPr>
           <w:p>
             <w:pPr>

</xml_diff>

<commit_message>
docs(guide): refine the input and result lifecycle wording
</commit_message>
<xml_diff>
--- a/docs/model-file-io-guide.docx
+++ b/docs/model-file-io-guide.docx
@@ -3070,7 +3070,7 @@
                 <w:color w:val="241B17"/>
                 <w:sz w:val="19"/>
               </w:rPr>
-              <w:t>任务开始时由平台准备</w:t>
+              <w:t>任务开始时由 TAA 将所需数据集拷贝到该目录</w:t>
             </w:r>
           </w:p>
         </w:tc>
@@ -3155,7 +3155,7 @@
                 <w:color w:val="241B17"/>
                 <w:sz w:val="19"/>
               </w:rPr>
-              <w:t>任务开始时创建；进程以 0 退出后收集并导出</w:t>
+              <w:t>任务开始时创建；进程正常结束后移出并落盘</w:t>
             </w:r>
           </w:p>
         </w:tc>

</xml_diff>

<commit_message>
docs(guide): detail the log and progress lifecycle
</commit_message>
<xml_diff>
--- a/docs/model-file-io-guide.docx
+++ b/docs/model-file-io-guide.docx
@@ -3240,7 +3240,7 @@
                 <w:color w:val="241B17"/>
                 <w:sz w:val="19"/>
               </w:rPr>
-              <w:t>每次任务开始前清空</w:t>
+              <w:t>任务结束后清空；执行期间逐行追加，可拆成多个 *.jsonl / *.log</w:t>
             </w:r>
           </w:p>
         </w:tc>
@@ -3325,7 +3325,7 @@
                 <w:color w:val="241B17"/>
                 <w:sz w:val="19"/>
               </w:rPr>
-              <w:t>进度文件在每次任务开始前删除</w:t>
+              <w:t>任务结束后清空；执行期间反复覆盖写入 progress.json</w:t>
             </w:r>
           </w:p>
         </w:tc>
@@ -8087,7 +8087,7 @@
                 <w:color w:val="241B17"/>
                 <w:sz w:val="19"/>
               </w:rPr>
-              <w:t xml:space="preserve">每次任务开始前 </w:t>
+              <w:t xml:space="preserve">任务结束后 </w:t>
             </w:r>
             <w:r>
               <w:rPr>
@@ -13006,7 +13006,7 @@
                 <w:color w:val="241B17"/>
                 <w:sz w:val="19"/>
               </w:rPr>
-              <w:t>每次任务开始前进度文件会被删除。若进度长时间不动，平台侧看到的进度条也会停住。</w:t>
+              <w:t>任务结束后进度文件会被清空。若进度长时间不动，平台侧看到的进度条也会停住。</w:t>
             </w:r>
           </w:p>
         </w:tc>

</xml_diff>

<commit_message>
docs(guide): make training_task optional in the result file
</commit_message>
<xml_diff>
--- a/docs/model-file-io-guide.docx
+++ b/docs/model-file-io-guide.docx
@@ -13301,7 +13301,7 @@
                 <w:color w:val="E58E4E"/>
                 <w:sz w:val="17"/>
               </w:rPr>
-              <w:t>"training_task"</w:t>
+              <w:t>"metrics"</w:t>
             </w:r>
             <w:r>
               <w:rPr>
@@ -13337,17 +13337,37 @@
                 <w:color w:val="E58E4E"/>
                 <w:sz w:val="17"/>
               </w:rPr>
-              <w:t>"metrics"</w:t>
-            </w:r>
-            <w:r>
-              <w:rPr>
-                <w:rFonts w:ascii="Consolas" w:hAnsi="Consolas" w:eastAsia="宋体" w:cs="Consolas"/>
-                <w:b w:val="0"/>
-                <w:i w:val="0"/>
-                <w:color w:val="8C8079"/>
-                <w:sz w:val="17"/>
-              </w:rPr>
-              <w:t>: {</w:t>
+              <w:t>"final_accuracy"</w:t>
+            </w:r>
+            <w:r>
+              <w:rPr>
+                <w:rFonts w:ascii="Consolas" w:hAnsi="Consolas" w:eastAsia="宋体" w:cs="Consolas"/>
+                <w:b w:val="0"/>
+                <w:i w:val="0"/>
+                <w:color w:val="8C8079"/>
+                <w:sz w:val="17"/>
+              </w:rPr>
+              <w:t xml:space="preserve">: </w:t>
+            </w:r>
+            <w:r>
+              <w:rPr>
+                <w:rFonts w:ascii="Consolas" w:hAnsi="Consolas" w:eastAsia="宋体" w:cs="Consolas"/>
+                <w:b w:val="0"/>
+                <w:i w:val="0"/>
+                <w:color w:val="D8B26A"/>
+                <w:sz w:val="17"/>
+              </w:rPr>
+              <w:t>0.9425</w:t>
+            </w:r>
+            <w:r>
+              <w:rPr>
+                <w:rFonts w:ascii="Consolas" w:hAnsi="Consolas" w:eastAsia="宋体" w:cs="Consolas"/>
+                <w:b w:val="0"/>
+                <w:i w:val="0"/>
+                <w:color w:val="8C8079"/>
+                <w:sz w:val="17"/>
+              </w:rPr>
+              <w:t>,</w:t>
             </w:r>
           </w:p>
           <w:p>
@@ -13363,7 +13383,7 @@
                 <w:color w:val="8C8079"/>
                 <w:sz w:val="17"/>
               </w:rPr>
-              <w:t xml:space="preserve">      </w:t>
+              <w:t xml:space="preserve">    </w:t>
             </w:r>
             <w:r>
               <w:rPr>
@@ -13373,7 +13393,7 @@
                 <w:color w:val="E58E4E"/>
                 <w:sz w:val="17"/>
               </w:rPr>
-              <w:t>"final_accuracy"</w:t>
+              <w:t>"final_loss"</w:t>
             </w:r>
             <w:r>
               <w:rPr>
@@ -13393,7 +13413,7 @@
                 <w:color w:val="D8B26A"/>
                 <w:sz w:val="17"/>
               </w:rPr>
-              <w:t>0.9425</w:t>
+              <w:t>0.1352</w:t>
             </w:r>
             <w:r>
               <w:rPr>
@@ -13419,7 +13439,7 @@
                 <w:color w:val="8C8079"/>
                 <w:sz w:val="17"/>
               </w:rPr>
-              <w:t xml:space="preserve">      </w:t>
+              <w:t xml:space="preserve">    </w:t>
             </w:r>
             <w:r>
               <w:rPr>
@@ -13429,7 +13449,7 @@
                 <w:color w:val="E58E4E"/>
                 <w:sz w:val="17"/>
               </w:rPr>
-              <w:t>"final_loss"</w:t>
+              <w:t>"final_auc"</w:t>
             </w:r>
             <w:r>
               <w:rPr>
@@ -13449,7 +13469,7 @@
                 <w:color w:val="D8B26A"/>
                 <w:sz w:val="17"/>
               </w:rPr>
-              <w:t>0.1352</w:t>
+              <w:t>0.9810</w:t>
             </w:r>
             <w:r>
               <w:rPr>
@@ -13475,7 +13495,7 @@
                 <w:color w:val="8C8079"/>
                 <w:sz w:val="17"/>
               </w:rPr>
-              <w:t xml:space="preserve">      </w:t>
+              <w:t xml:space="preserve">    </w:t>
             </w:r>
             <w:r>
               <w:rPr>
@@ -13485,7 +13505,7 @@
                 <w:color w:val="E58E4E"/>
                 <w:sz w:val="17"/>
               </w:rPr>
-              <w:t>"final_auc"</w:t>
+              <w:t>"final_f1"</w:t>
             </w:r>
             <w:r>
               <w:rPr>
@@ -13505,7 +13525,7 @@
                 <w:color w:val="D8B26A"/>
                 <w:sz w:val="17"/>
               </w:rPr>
-              <w:t>0.9810</w:t>
+              <w:t>0.9380</w:t>
             </w:r>
             <w:r>
               <w:rPr>
@@ -13531,7 +13551,7 @@
                 <w:color w:val="8C8079"/>
                 <w:sz w:val="17"/>
               </w:rPr>
-              <w:t xml:space="preserve">      </w:t>
+              <w:t xml:space="preserve">    </w:t>
             </w:r>
             <w:r>
               <w:rPr>
@@ -13541,37 +13561,17 @@
                 <w:color w:val="E58E4E"/>
                 <w:sz w:val="17"/>
               </w:rPr>
-              <w:t>"final_f1"</w:t>
-            </w:r>
-            <w:r>
-              <w:rPr>
-                <w:rFonts w:ascii="Consolas" w:hAnsi="Consolas" w:eastAsia="宋体" w:cs="Consolas"/>
-                <w:b w:val="0"/>
-                <w:i w:val="0"/>
-                <w:color w:val="8C8079"/>
-                <w:sz w:val="17"/>
-              </w:rPr>
-              <w:t xml:space="preserve">: </w:t>
-            </w:r>
-            <w:r>
-              <w:rPr>
-                <w:rFonts w:ascii="Consolas" w:hAnsi="Consolas" w:eastAsia="宋体" w:cs="Consolas"/>
-                <w:b w:val="0"/>
-                <w:i w:val="0"/>
-                <w:color w:val="D8B26A"/>
-                <w:sz w:val="17"/>
-              </w:rPr>
-              <w:t>0.9380</w:t>
-            </w:r>
-            <w:r>
-              <w:rPr>
-                <w:rFonts w:ascii="Consolas" w:hAnsi="Consolas" w:eastAsia="宋体" w:cs="Consolas"/>
-                <w:b w:val="0"/>
-                <w:i w:val="0"/>
-                <w:color w:val="8C8079"/>
-                <w:sz w:val="17"/>
-              </w:rPr>
-              <w:t>,</w:t>
+              <w:t>"epochs"</w:t>
+            </w:r>
+            <w:r>
+              <w:rPr>
+                <w:rFonts w:ascii="Consolas" w:hAnsi="Consolas" w:eastAsia="宋体" w:cs="Consolas"/>
+                <w:b w:val="0"/>
+                <w:i w:val="0"/>
+                <w:color w:val="8C8079"/>
+                <w:sz w:val="17"/>
+              </w:rPr>
+              <w:t>: [</w:t>
             </w:r>
           </w:p>
           <w:p>
@@ -13587,7 +13587,7 @@
                 <w:color w:val="8C8079"/>
                 <w:sz w:val="17"/>
               </w:rPr>
-              <w:t xml:space="preserve">      </w:t>
+              <w:t xml:space="preserve">      {</w:t>
             </w:r>
             <w:r>
               <w:rPr>
@@ -13597,17 +13597,117 @@
                 <w:color w:val="E58E4E"/>
                 <w:sz w:val="17"/>
               </w:rPr>
-              <w:t>"epochs"</w:t>
-            </w:r>
-            <w:r>
-              <w:rPr>
-                <w:rFonts w:ascii="Consolas" w:hAnsi="Consolas" w:eastAsia="宋体" w:cs="Consolas"/>
-                <w:b w:val="0"/>
-                <w:i w:val="0"/>
-                <w:color w:val="8C8079"/>
-                <w:sz w:val="17"/>
-              </w:rPr>
-              <w:t>: [</w:t>
+              <w:t>"epoch"</w:t>
+            </w:r>
+            <w:r>
+              <w:rPr>
+                <w:rFonts w:ascii="Consolas" w:hAnsi="Consolas" w:eastAsia="宋体" w:cs="Consolas"/>
+                <w:b w:val="0"/>
+                <w:i w:val="0"/>
+                <w:color w:val="8C8079"/>
+                <w:sz w:val="17"/>
+              </w:rPr>
+              <w:t xml:space="preserve">: </w:t>
+            </w:r>
+            <w:r>
+              <w:rPr>
+                <w:rFonts w:ascii="Consolas" w:hAnsi="Consolas" w:eastAsia="宋体" w:cs="Consolas"/>
+                <w:b w:val="0"/>
+                <w:i w:val="0"/>
+                <w:color w:val="D8B26A"/>
+                <w:sz w:val="17"/>
+              </w:rPr>
+              <w:t>1</w:t>
+            </w:r>
+            <w:r>
+              <w:rPr>
+                <w:rFonts w:ascii="Consolas" w:hAnsi="Consolas" w:eastAsia="宋体" w:cs="Consolas"/>
+                <w:b w:val="0"/>
+                <w:i w:val="0"/>
+                <w:color w:val="8C8079"/>
+                <w:sz w:val="17"/>
+              </w:rPr>
+              <w:t xml:space="preserve">, </w:t>
+            </w:r>
+            <w:r>
+              <w:rPr>
+                <w:rFonts w:ascii="Consolas" w:hAnsi="Consolas" w:eastAsia="宋体" w:cs="Consolas"/>
+                <w:b w:val="0"/>
+                <w:i w:val="0"/>
+                <w:color w:val="E58E4E"/>
+                <w:sz w:val="17"/>
+              </w:rPr>
+              <w:t>"accuracy"</w:t>
+            </w:r>
+            <w:r>
+              <w:rPr>
+                <w:rFonts w:ascii="Consolas" w:hAnsi="Consolas" w:eastAsia="宋体" w:cs="Consolas"/>
+                <w:b w:val="0"/>
+                <w:i w:val="0"/>
+                <w:color w:val="8C8079"/>
+                <w:sz w:val="17"/>
+              </w:rPr>
+              <w:t xml:space="preserve">: </w:t>
+            </w:r>
+            <w:r>
+              <w:rPr>
+                <w:rFonts w:ascii="Consolas" w:hAnsi="Consolas" w:eastAsia="宋体" w:cs="Consolas"/>
+                <w:b w:val="0"/>
+                <w:i w:val="0"/>
+                <w:color w:val="D8B26A"/>
+                <w:sz w:val="17"/>
+              </w:rPr>
+              <w:t>0.6500</w:t>
+            </w:r>
+            <w:r>
+              <w:rPr>
+                <w:rFonts w:ascii="Consolas" w:hAnsi="Consolas" w:eastAsia="宋体" w:cs="Consolas"/>
+                <w:b w:val="0"/>
+                <w:i w:val="0"/>
+                <w:color w:val="8C8079"/>
+                <w:sz w:val="17"/>
+              </w:rPr>
+              <w:t xml:space="preserve">, </w:t>
+            </w:r>
+            <w:r>
+              <w:rPr>
+                <w:rFonts w:ascii="Consolas" w:hAnsi="Consolas" w:eastAsia="宋体" w:cs="Consolas"/>
+                <w:b w:val="0"/>
+                <w:i w:val="0"/>
+                <w:color w:val="E58E4E"/>
+                <w:sz w:val="17"/>
+              </w:rPr>
+              <w:t>"loss"</w:t>
+            </w:r>
+            <w:r>
+              <w:rPr>
+                <w:rFonts w:ascii="Consolas" w:hAnsi="Consolas" w:eastAsia="宋体" w:cs="Consolas"/>
+                <w:b w:val="0"/>
+                <w:i w:val="0"/>
+                <w:color w:val="8C8079"/>
+                <w:sz w:val="17"/>
+              </w:rPr>
+              <w:t xml:space="preserve">: </w:t>
+            </w:r>
+            <w:r>
+              <w:rPr>
+                <w:rFonts w:ascii="Consolas" w:hAnsi="Consolas" w:eastAsia="宋体" w:cs="Consolas"/>
+                <w:b w:val="0"/>
+                <w:i w:val="0"/>
+                <w:color w:val="D8B26A"/>
+                <w:sz w:val="17"/>
+              </w:rPr>
+              <w:t>0.8500</w:t>
+            </w:r>
+            <w:r>
+              <w:rPr>
+                <w:rFonts w:ascii="Consolas" w:hAnsi="Consolas" w:eastAsia="宋体" w:cs="Consolas"/>
+                <w:b w:val="0"/>
+                <w:i w:val="0"/>
+                <w:color w:val="8C8079"/>
+                <w:sz w:val="17"/>
+              </w:rPr>
+              <w:t>},</w:t>
             </w:r>
           </w:p>
           <w:p>
@@ -13623,7 +13723,7 @@
                 <w:color w:val="8C8079"/>
                 <w:sz w:val="17"/>
               </w:rPr>
-              <w:t xml:space="preserve">        {</w:t>
+              <w:t xml:space="preserve">      {</w:t>
             </w:r>
             <w:r>
               <w:rPr>
@@ -13653,7 +13753,7 @@
                 <w:color w:val="D8B26A"/>
                 <w:sz w:val="17"/>
               </w:rPr>
-              <w:t>1</w:t>
+              <w:t>2</w:t>
             </w:r>
             <w:r>
               <w:rPr>
@@ -13693,7 +13793,7 @@
                 <w:color w:val="D8B26A"/>
                 <w:sz w:val="17"/>
               </w:rPr>
-              <w:t>0.6500</w:t>
+              <w:t>0.8100</w:t>
             </w:r>
             <w:r>
               <w:rPr>
@@ -13733,7 +13833,7 @@
                 <w:color w:val="D8B26A"/>
                 <w:sz w:val="17"/>
               </w:rPr>
-              <w:t>0.8500</w:t>
+              <w:t>0.4200</w:t>
             </w:r>
             <w:r>
               <w:rPr>
@@ -13759,7 +13859,7 @@
                 <w:color w:val="8C8079"/>
                 <w:sz w:val="17"/>
               </w:rPr>
-              <w:t xml:space="preserve">        {</w:t>
+              <w:t xml:space="preserve">      {</w:t>
             </w:r>
             <w:r>
               <w:rPr>
@@ -13789,7 +13889,7 @@
                 <w:color w:val="D8B26A"/>
                 <w:sz w:val="17"/>
               </w:rPr>
-              <w:t>2</w:t>
+              <w:t>3</w:t>
             </w:r>
             <w:r>
               <w:rPr>
@@ -13829,7 +13929,7 @@
                 <w:color w:val="D8B26A"/>
                 <w:sz w:val="17"/>
               </w:rPr>
-              <w:t>0.8100</w:t>
+              <w:t>0.9425</w:t>
             </w:r>
             <w:r>
               <w:rPr>
@@ -13869,17 +13969,17 @@
                 <w:color w:val="D8B26A"/>
                 <w:sz w:val="17"/>
               </w:rPr>
-              <w:t>0.4200</w:t>
-            </w:r>
-            <w:r>
-              <w:rPr>
-                <w:rFonts w:ascii="Consolas" w:hAnsi="Consolas" w:eastAsia="宋体" w:cs="Consolas"/>
-                <w:b w:val="0"/>
-                <w:i w:val="0"/>
-                <w:color w:val="8C8079"/>
-                <w:sz w:val="17"/>
-              </w:rPr>
-              <w:t>},</w:t>
+              <w:t>0.1352</w:t>
+            </w:r>
+            <w:r>
+              <w:rPr>
+                <w:rFonts w:ascii="Consolas" w:hAnsi="Consolas" w:eastAsia="宋体" w:cs="Consolas"/>
+                <w:b w:val="0"/>
+                <w:i w:val="0"/>
+                <w:color w:val="8C8079"/>
+                <w:sz w:val="17"/>
+              </w:rPr>
+              <w:t>}</w:t>
             </w:r>
           </w:p>
           <w:p>
@@ -13895,159 +13995,7 @@
                 <w:color w:val="8C8079"/>
                 <w:sz w:val="17"/>
               </w:rPr>
-              <w:t xml:space="preserve">        {</w:t>
-            </w:r>
-            <w:r>
-              <w:rPr>
-                <w:rFonts w:ascii="Consolas" w:hAnsi="Consolas" w:eastAsia="宋体" w:cs="Consolas"/>
-                <w:b w:val="0"/>
-                <w:i w:val="0"/>
-                <w:color w:val="E58E4E"/>
-                <w:sz w:val="17"/>
-              </w:rPr>
-              <w:t>"epoch"</w:t>
-            </w:r>
-            <w:r>
-              <w:rPr>
-                <w:rFonts w:ascii="Consolas" w:hAnsi="Consolas" w:eastAsia="宋体" w:cs="Consolas"/>
-                <w:b w:val="0"/>
-                <w:i w:val="0"/>
-                <w:color w:val="8C8079"/>
-                <w:sz w:val="17"/>
-              </w:rPr>
-              <w:t xml:space="preserve">: </w:t>
-            </w:r>
-            <w:r>
-              <w:rPr>
-                <w:rFonts w:ascii="Consolas" w:hAnsi="Consolas" w:eastAsia="宋体" w:cs="Consolas"/>
-                <w:b w:val="0"/>
-                <w:i w:val="0"/>
-                <w:color w:val="D8B26A"/>
-                <w:sz w:val="17"/>
-              </w:rPr>
-              <w:t>3</w:t>
-            </w:r>
-            <w:r>
-              <w:rPr>
-                <w:rFonts w:ascii="Consolas" w:hAnsi="Consolas" w:eastAsia="宋体" w:cs="Consolas"/>
-                <w:b w:val="0"/>
-                <w:i w:val="0"/>
-                <w:color w:val="8C8079"/>
-                <w:sz w:val="17"/>
-              </w:rPr>
-              <w:t xml:space="preserve">, </w:t>
-            </w:r>
-            <w:r>
-              <w:rPr>
-                <w:rFonts w:ascii="Consolas" w:hAnsi="Consolas" w:eastAsia="宋体" w:cs="Consolas"/>
-                <w:b w:val="0"/>
-                <w:i w:val="0"/>
-                <w:color w:val="E58E4E"/>
-                <w:sz w:val="17"/>
-              </w:rPr>
-              <w:t>"accuracy"</w:t>
-            </w:r>
-            <w:r>
-              <w:rPr>
-                <w:rFonts w:ascii="Consolas" w:hAnsi="Consolas" w:eastAsia="宋体" w:cs="Consolas"/>
-                <w:b w:val="0"/>
-                <w:i w:val="0"/>
-                <w:color w:val="8C8079"/>
-                <w:sz w:val="17"/>
-              </w:rPr>
-              <w:t xml:space="preserve">: </w:t>
-            </w:r>
-            <w:r>
-              <w:rPr>
-                <w:rFonts w:ascii="Consolas" w:hAnsi="Consolas" w:eastAsia="宋体" w:cs="Consolas"/>
-                <w:b w:val="0"/>
-                <w:i w:val="0"/>
-                <w:color w:val="D8B26A"/>
-                <w:sz w:val="17"/>
-              </w:rPr>
-              <w:t>0.9425</w:t>
-            </w:r>
-            <w:r>
-              <w:rPr>
-                <w:rFonts w:ascii="Consolas" w:hAnsi="Consolas" w:eastAsia="宋体" w:cs="Consolas"/>
-                <w:b w:val="0"/>
-                <w:i w:val="0"/>
-                <w:color w:val="8C8079"/>
-                <w:sz w:val="17"/>
-              </w:rPr>
-              <w:t xml:space="preserve">, </w:t>
-            </w:r>
-            <w:r>
-              <w:rPr>
-                <w:rFonts w:ascii="Consolas" w:hAnsi="Consolas" w:eastAsia="宋体" w:cs="Consolas"/>
-                <w:b w:val="0"/>
-                <w:i w:val="0"/>
-                <w:color w:val="E58E4E"/>
-                <w:sz w:val="17"/>
-              </w:rPr>
-              <w:t>"loss"</w:t>
-            </w:r>
-            <w:r>
-              <w:rPr>
-                <w:rFonts w:ascii="Consolas" w:hAnsi="Consolas" w:eastAsia="宋体" w:cs="Consolas"/>
-                <w:b w:val="0"/>
-                <w:i w:val="0"/>
-                <w:color w:val="8C8079"/>
-                <w:sz w:val="17"/>
-              </w:rPr>
-              <w:t xml:space="preserve">: </w:t>
-            </w:r>
-            <w:r>
-              <w:rPr>
-                <w:rFonts w:ascii="Consolas" w:hAnsi="Consolas" w:eastAsia="宋体" w:cs="Consolas"/>
-                <w:b w:val="0"/>
-                <w:i w:val="0"/>
-                <w:color w:val="D8B26A"/>
-                <w:sz w:val="17"/>
-              </w:rPr>
-              <w:t>0.1352</w:t>
-            </w:r>
-            <w:r>
-              <w:rPr>
-                <w:rFonts w:ascii="Consolas" w:hAnsi="Consolas" w:eastAsia="宋体" w:cs="Consolas"/>
-                <w:b w:val="0"/>
-                <w:i w:val="0"/>
-                <w:color w:val="8C8079"/>
-                <w:sz w:val="17"/>
-              </w:rPr>
-              <w:t>}</w:t>
-            </w:r>
-          </w:p>
-          <w:p>
-            <w:pPr>
-              <w:spacing w:before="0" w:after="0" w:line="278" w:lineRule="auto"/>
-              <w:ind w:left="0"/>
-            </w:pPr>
-            <w:r>
-              <w:rPr>
-                <w:rFonts w:ascii="Consolas" w:hAnsi="Consolas" w:eastAsia="宋体" w:cs="Consolas"/>
-                <w:b w:val="0"/>
-                <w:i w:val="0"/>
-                <w:color w:val="8C8079"/>
-                <w:sz w:val="17"/>
-              </w:rPr>
-              <w:t xml:space="preserve">      ]</w:t>
-            </w:r>
-          </w:p>
-          <w:p>
-            <w:pPr>
-              <w:spacing w:before="0" w:after="0" w:line="278" w:lineRule="auto"/>
-              <w:ind w:left="0"/>
-            </w:pPr>
-            <w:r>
-              <w:rPr>
-                <w:rFonts w:ascii="Consolas" w:hAnsi="Consolas" w:eastAsia="宋体" w:cs="Consolas"/>
-                <w:b w:val="0"/>
-                <w:i w:val="0"/>
-                <w:color w:val="8C8079"/>
-                <w:sz w:val="17"/>
-              </w:rPr>
-              <w:t xml:space="preserve">    }</w:t>
+              <w:t xml:space="preserve">    ]</w:t>
             </w:r>
           </w:p>
           <w:p>
@@ -14450,7 +14398,7 @@
                 <w:color w:val="A8261B"/>
                 <w:sz w:val="17"/>
               </w:rPr>
-              <w:t>training_task</w:t>
+              <w:t>metrics</w:t>
             </w:r>
           </w:p>
         </w:tc>
@@ -14470,7 +14418,7 @@
                 <w:color w:val="241B17"/>
                 <w:sz w:val="19"/>
               </w:rPr>
-              <w:t xml:space="preserve">训练任务信息，其中 </w:t>
+              <w:t xml:space="preserve">训练指标，键名自定，原样并入报告的 </w:t>
             </w:r>
             <w:r>
               <w:rPr>
@@ -14480,17 +14428,7 @@
                 <w:color w:val="A8261B"/>
                 <w:sz w:val="18"/>
               </w:rPr>
-              <w:t>metrics</w:t>
-            </w:r>
-            <w:r>
-              <w:rPr>
-                <w:rFonts w:ascii="Calibri" w:hAnsi="Calibri" w:eastAsia="宋体" w:cs="Calibri"/>
-                <w:b w:val="0"/>
-                <w:i w:val="0"/>
-                <w:color w:val="241B17"/>
-                <w:sz w:val="19"/>
-              </w:rPr>
-              <w:t xml:space="preserve"> 为训练指标，键名自定，原样并入报告</w:t>
+              <w:t>training_task.metrics</w:t>
             </w:r>
           </w:p>
         </w:tc>
@@ -14628,6 +14566,63 @@
           <w:color w:val="241B17"/>
           <w:sz w:val="4"/>
         </w:rPr>
+      </w:r>
+    </w:p>
+    <w:p>
+      <w:pPr>
+        <w:spacing w:before="0" w:after="160" w:line="360" w:lineRule="auto"/>
+        <w:ind w:firstLine="420"/>
+        <w:jc w:val="both"/>
+      </w:pPr>
+      <w:r>
+        <w:rPr>
+          <w:rFonts w:ascii="Calibri" w:hAnsi="Calibri" w:eastAsia="宋体" w:cs="Calibri"/>
+          <w:b w:val="0"/>
+          <w:i w:val="0"/>
+          <w:color w:val="241B17"/>
+          <w:sz w:val="21"/>
+        </w:rPr>
+        <w:t xml:space="preserve">为兼容旧版本，把指标写在 </w:t>
+      </w:r>
+      <w:r>
+        <w:rPr>
+          <w:rFonts w:ascii="Consolas" w:hAnsi="Consolas" w:eastAsia="宋体" w:cs="Consolas"/>
+          <w:b w:val="0"/>
+          <w:i w:val="0"/>
+          <w:color w:val="A8261B"/>
+          <w:sz w:val="20"/>
+        </w:rPr>
+        <w:t>training_task.metrics</w:t>
+      </w:r>
+      <w:r>
+        <w:rPr>
+          <w:rFonts w:ascii="Calibri" w:hAnsi="Calibri" w:eastAsia="宋体" w:cs="Calibri"/>
+          <w:b w:val="0"/>
+          <w:i w:val="0"/>
+          <w:color w:val="241B17"/>
+          <w:sz w:val="21"/>
+        </w:rPr>
+        <w:t xml:space="preserve"> 下仍会被读取；新接入的代码建议直接使用顶层 </w:t>
+      </w:r>
+      <w:r>
+        <w:rPr>
+          <w:rFonts w:ascii="Consolas" w:hAnsi="Consolas" w:eastAsia="宋体" w:cs="Consolas"/>
+          <w:b w:val="0"/>
+          <w:i w:val="0"/>
+          <w:color w:val="A8261B"/>
+          <w:sz w:val="20"/>
+        </w:rPr>
+        <w:t>metrics</w:t>
+      </w:r>
+      <w:r>
+        <w:rPr>
+          <w:rFonts w:ascii="Calibri" w:hAnsi="Calibri" w:eastAsia="宋体" w:cs="Calibri"/>
+          <w:b w:val="0"/>
+          <w:i w:val="0"/>
+          <w:color w:val="241B17"/>
+          <w:sz w:val="21"/>
+        </w:rPr>
+        <w:t>。</w:t>
       </w:r>
     </w:p>
     <w:p>
@@ -16701,7 +16696,7 @@
           <w:color w:val="A8261B"/>
           <w:sz w:val="20"/>
         </w:rPr>
-        <w:t>training_task.metrics</w:t>
+        <w:t>metrics</w:t>
       </w:r>
       <w:r>
         <w:rPr>
@@ -19103,7 +19098,7 @@
                 <w:color w:val="9DC97F"/>
                 <w:sz w:val="17"/>
               </w:rPr>
-              <w:t>"training_task"</w:t>
+              <w:t>"metrics"</w:t>
             </w:r>
             <w:r>
               <w:rPr>
@@ -19123,26 +19118,6 @@
                 <w:color w:val="9DC97F"/>
                 <w:sz w:val="17"/>
               </w:rPr>
-              <w:t>"metrics"</w:t>
-            </w:r>
-            <w:r>
-              <w:rPr>
-                <w:rFonts w:ascii="Consolas" w:hAnsi="Consolas" w:eastAsia="宋体" w:cs="Consolas"/>
-                <w:b w:val="0"/>
-                <w:i w:val="0"/>
-                <w:color w:val="8C8079"/>
-                <w:sz w:val="17"/>
-              </w:rPr>
-              <w:t>: {</w:t>
-            </w:r>
-            <w:r>
-              <w:rPr>
-                <w:rFonts w:ascii="Consolas" w:hAnsi="Consolas" w:eastAsia="宋体" w:cs="Consolas"/>
-                <w:b w:val="0"/>
-                <w:i w:val="0"/>
-                <w:color w:val="9DC97F"/>
-                <w:sz w:val="17"/>
-              </w:rPr>
               <w:t>"final_loss"</w:t>
             </w:r>
             <w:r>
@@ -19173,7 +19148,7 @@
                 <w:color w:val="8C8079"/>
                 <w:sz w:val="17"/>
               </w:rPr>
-              <w:t>}},</w:t>
+              <w:t>},</w:t>
             </w:r>
           </w:p>
           <w:p>

</xml_diff>

<commit_message>
docs(guide): drop the product size limit
</commit_message>
<xml_diff>
--- a/docs/model-file-io-guide.docx
+++ b/docs/model-file-io-guide.docx
@@ -15870,51 +15870,6 @@
           </w:p>
         </w:tc>
       </w:tr>
-      <w:tr>
-        <w:trPr>
-          <w:cantSplit w:val="true"/>
-        </w:trPr>
-        <w:tc>
-          <w:tcPr>
-            <w:tcW w:type="dxa" w:w="4649"/>
-          </w:tcPr>
-          <w:p>
-            <w:pPr>
-              <w:spacing w:before="0" w:after="0" w:line="312" w:lineRule="auto"/>
-            </w:pPr>
-            <w:r>
-              <w:rPr>
-                <w:rFonts w:ascii="Calibri" w:hAnsi="Calibri" w:eastAsia="宋体" w:cs="Calibri"/>
-                <w:b w:val="0"/>
-                <w:i w:val="0"/>
-                <w:color w:val="241B17"/>
-                <w:sz w:val="19"/>
-              </w:rPr>
-              <w:t>单次产物超过大小上限（默认 3 GB）</w:t>
-            </w:r>
-          </w:p>
-        </w:tc>
-        <w:tc>
-          <w:tcPr>
-            <w:tcW w:type="dxa" w:w="4535"/>
-          </w:tcPr>
-          <w:p>
-            <w:pPr>
-              <w:spacing w:before="0" w:after="0" w:line="312" w:lineRule="auto"/>
-            </w:pPr>
-            <w:r>
-              <w:rPr>
-                <w:rFonts w:ascii="Calibri" w:hAnsi="Calibri" w:eastAsia="宋体" w:cs="Calibri"/>
-                <w:b w:val="0"/>
-                <w:i w:val="0"/>
-                <w:color w:val="241B17"/>
-                <w:sz w:val="19"/>
-              </w:rPr>
-              <w:t>导出被拒绝</w:t>
-            </w:r>
-          </w:p>
-        </w:tc>
-      </w:tr>
     </w:tbl>
     <w:p>
       <w:pPr>
@@ -16309,7 +16264,7 @@
           <w:color w:val="241B17"/>
           <w:sz w:val="21"/>
         </w:rPr>
-        <w:t xml:space="preserve"> 下的文件都会被导出，且单个产物受大小上限（默认 3 GB）限制。只放需要交付的文件，中间产物写到别处或不保留。</w:t>
+        <w:t xml:space="preserve"> 下的文件都会被导出，体积越大导出耗时越长。只放需要交付的文件，中间产物写到别处或不保留。</w:t>
       </w:r>
     </w:p>
     <w:p>
@@ -17367,7 +17322,7 @@
                 <w:color w:val="241B17"/>
                 <w:sz w:val="19"/>
               </w:rPr>
-              <w:t>任意文件，单个不超过 3 GB</w:t>
+              <w:t>任意文件</w:t>
             </w:r>
           </w:p>
         </w:tc>

</xml_diff>

<commit_message>
docs(guide): rename the pre-launch checklist to pre-upload
</commit_message>
<xml_diff>
--- a/docs/model-file-io-guide.docx
+++ b/docs/model-file-io-guide.docx
@@ -1573,7 +1573,7 @@
           <w:color w:val="241B17"/>
           <w:sz w:val="21"/>
         </w:rPr>
-        <w:t>9  上线前检查清单</w:t>
+        <w:t>9  上传前检查清单</w:t>
       </w:r>
     </w:p>
     <w:p>
@@ -16282,7 +16282,7 @@
           <w:color w:val="241B17"/>
           <w:sz w:val="36"/>
         </w:rPr>
-        <w:t>9  上线前检查清单</w:t>
+        <w:t>9  上传前检查清单</w:t>
       </w:r>
     </w:p>
     <w:p>
@@ -16299,7 +16299,7 @@
           <w:color w:val="241B17"/>
           <w:sz w:val="21"/>
         </w:rPr>
-        <w:t>提交上线前，请逐项确认以下内容：</w:t>
+        <w:t>上传前，请逐项确认以下内容：</w:t>
       </w:r>
     </w:p>
     <w:p>

</xml_diff>

<commit_message>
docs(guide): fold the example-content note into the layout table
</commit_message>
<xml_diff>
--- a/docs/model-file-io-guide.docx
+++ b/docs/model-file-io-guide.docx
@@ -2497,7 +2497,7 @@
                 <w:color w:val="A8261B"/>
                 <w:sz w:val="17"/>
               </w:rPr>
-              <w:t xml:space="preserve">    │   └── test_result.xlsx</w:t>
+              <w:t xml:space="preserve">    │   ├── test_result.xlsx</w:t>
             </w:r>
           </w:p>
         </w:tc>
@@ -2532,6 +2532,51 @@
                 <w:color w:val="A8261B"/>
                 <w:sz w:val="17"/>
               </w:rPr>
+              <w:t xml:space="preserve">    │   └── …</w:t>
+            </w:r>
+          </w:p>
+        </w:tc>
+        <w:tc>
+          <w:tcPr>
+            <w:tcW w:type="dxa" w:w="4422"/>
+          </w:tcPr>
+          <w:p>
+            <w:pPr>
+              <w:spacing w:before="0" w:after="0" w:line="312" w:lineRule="auto"/>
+            </w:pPr>
+            <w:r>
+              <w:rPr>
+                <w:rFonts w:ascii="Calibri" w:hAnsi="Calibri" w:eastAsia="宋体" w:cs="Calibri"/>
+                <w:b w:val="0"/>
+                <w:i w:val="0"/>
+                <w:color w:val="241B17"/>
+                <w:sz w:val="19"/>
+              </w:rPr>
+              <w:t>以上为示例，按实际交付内容增删</w:t>
+            </w:r>
+          </w:p>
+        </w:tc>
+      </w:tr>
+      <w:tr>
+        <w:trPr>
+          <w:cantSplit w:val="true"/>
+        </w:trPr>
+        <w:tc>
+          <w:tcPr>
+            <w:tcW w:type="dxa" w:w="4762"/>
+          </w:tcPr>
+          <w:p>
+            <w:pPr>
+              <w:spacing w:before="0" w:after="0" w:line="312" w:lineRule="auto"/>
+            </w:pPr>
+            <w:r>
+              <w:rPr>
+                <w:rFonts w:ascii="Consolas" w:hAnsi="Consolas" w:eastAsia="宋体" w:cs="Consolas"/>
+                <w:b w:val="0"/>
+                <w:i w:val="0"/>
+                <w:color w:val="A8261B"/>
+                <w:sz w:val="17"/>
+              </w:rPr>
               <w:t xml:space="preserve">    ├── log/</w:t>
             </w:r>
           </w:p>
@@ -2750,93 +2795,6 @@
           <w:color w:val="241B17"/>
           <w:sz w:val="4"/>
         </w:rPr>
-      </w:r>
-    </w:p>
-    <w:p>
-      <w:pPr>
-        <w:spacing w:before="0" w:after="160" w:line="360" w:lineRule="auto"/>
-        <w:ind w:firstLine="420"/>
-        <w:jc w:val="both"/>
-      </w:pPr>
-      <w:r>
-        <w:rPr>
-          <w:rFonts w:ascii="Consolas" w:hAnsi="Consolas" w:eastAsia="宋体" w:cs="Consolas"/>
-          <w:b w:val="0"/>
-          <w:i w:val="0"/>
-          <w:color w:val="A8261B"/>
-          <w:sz w:val="20"/>
-        </w:rPr>
-        <w:t>result/</w:t>
-      </w:r>
-      <w:r>
-        <w:rPr>
-          <w:rFonts w:ascii="Calibri" w:hAnsi="Calibri" w:eastAsia="宋体" w:cs="Calibri"/>
-          <w:b w:val="0"/>
-          <w:i w:val="0"/>
-          <w:color w:val="241B17"/>
-          <w:sz w:val="21"/>
-        </w:rPr>
-        <w:t xml:space="preserve"> 下的 </w:t>
-      </w:r>
-      <w:r>
-        <w:rPr>
-          <w:rFonts w:ascii="Consolas" w:hAnsi="Consolas" w:eastAsia="宋体" w:cs="Consolas"/>
-          <w:b w:val="0"/>
-          <w:i w:val="0"/>
-          <w:color w:val="A8261B"/>
-          <w:sz w:val="20"/>
-        </w:rPr>
-        <w:t>weights/</w:t>
-      </w:r>
-      <w:r>
-        <w:rPr>
-          <w:rFonts w:ascii="Calibri" w:hAnsi="Calibri" w:eastAsia="宋体" w:cs="Calibri"/>
-          <w:b w:val="0"/>
-          <w:i w:val="0"/>
-          <w:color w:val="241B17"/>
-          <w:sz w:val="21"/>
-        </w:rPr>
-        <w:t>、</w:t>
-      </w:r>
-      <w:r>
-        <w:rPr>
-          <w:rFonts w:ascii="Consolas" w:hAnsi="Consolas" w:eastAsia="宋体" w:cs="Consolas"/>
-          <w:b w:val="0"/>
-          <w:i w:val="0"/>
-          <w:color w:val="A8261B"/>
-          <w:sz w:val="20"/>
-        </w:rPr>
-        <w:t>training_result.json</w:t>
-      </w:r>
-      <w:r>
-        <w:rPr>
-          <w:rFonts w:ascii="Calibri" w:hAnsi="Calibri" w:eastAsia="宋体" w:cs="Calibri"/>
-          <w:b w:val="0"/>
-          <w:i w:val="0"/>
-          <w:color w:val="241B17"/>
-          <w:sz w:val="21"/>
-        </w:rPr>
-        <w:t>、</w:t>
-      </w:r>
-      <w:r>
-        <w:rPr>
-          <w:rFonts w:ascii="Consolas" w:hAnsi="Consolas" w:eastAsia="宋体" w:cs="Consolas"/>
-          <w:b w:val="0"/>
-          <w:i w:val="0"/>
-          <w:color w:val="A8261B"/>
-          <w:sz w:val="20"/>
-        </w:rPr>
-        <w:t>test_result.xlsx</w:t>
-      </w:r>
-      <w:r>
-        <w:rPr>
-          <w:rFonts w:ascii="Calibri" w:hAnsi="Calibri" w:eastAsia="宋体" w:cs="Calibri"/>
-          <w:b w:val="0"/>
-          <w:i w:val="0"/>
-          <w:color w:val="241B17"/>
-          <w:sz w:val="21"/>
-        </w:rPr>
-        <w:t xml:space="preserve"> 是示例，按实际交付内容替换。</w:t>
       </w:r>
     </w:p>
     <w:p>

</xml_diff>

<commit_message>
docs(guide): rewrite the failure-path note around the dataset field
</commit_message>
<xml_diff>
--- a/docs/model-file-io-guide.docx
+++ b/docs/model-file-io-guide.docx
@@ -15245,7 +15245,94 @@
           <w:color w:val="241B17"/>
           <w:sz w:val="24"/>
         </w:rPr>
-        <w:t xml:space="preserve">文件缺失不会导致任务失败，但报告里就没有对应指标。建议在 </w:t>
+        <w:t>文件缺失不会导致任务失败，但报告里会缺少数据集规模等信息，事后核对样本量、划分比例只能翻日志，平台也难以按统一口径统计。</w:t>
+      </w:r>
+      <w:r>
+        <w:rPr>
+          <w:rFonts w:ascii="Consolas" w:hAnsi="Consolas" w:eastAsia="宋体" w:cs="Consolas"/>
+          <w:b w:val="0"/>
+          <w:i w:val="0"/>
+          <w:color w:val="A8261B"/>
+          <w:sz w:val="23"/>
+        </w:rPr>
+        <w:t>training_task</w:t>
+      </w:r>
+      <w:r>
+        <w:rPr>
+          <w:rFonts w:ascii="Calibri" w:hAnsi="Calibri" w:eastAsia="宋体" w:cs="Calibri"/>
+          <w:b w:val="0"/>
+          <w:i w:val="0"/>
+          <w:color w:val="241B17"/>
+          <w:sz w:val="24"/>
+        </w:rPr>
+        <w:t xml:space="preserve"> 已不再要求，该文件真正需要提供的只有顶层 </w:t>
+      </w:r>
+      <w:r>
+        <w:rPr>
+          <w:rFonts w:ascii="Consolas" w:hAnsi="Consolas" w:eastAsia="宋体" w:cs="Consolas"/>
+          <w:b w:val="0"/>
+          <w:i w:val="0"/>
+          <w:color w:val="A8261B"/>
+          <w:sz w:val="23"/>
+        </w:rPr>
+        <w:t>dataset</w:t>
+      </w:r>
+      <w:r>
+        <w:rPr>
+          <w:rFonts w:ascii="Calibri" w:hAnsi="Calibri" w:eastAsia="宋体" w:cs="Calibri"/>
+          <w:b w:val="0"/>
+          <w:i w:val="0"/>
+          <w:color w:val="241B17"/>
+          <w:sz w:val="24"/>
+        </w:rPr>
+        <w:t>，</w:t>
+      </w:r>
+      <w:r>
+        <w:rPr>
+          <w:rFonts w:ascii="Consolas" w:hAnsi="Consolas" w:eastAsia="宋体" w:cs="Consolas"/>
+          <w:b w:val="0"/>
+          <w:i w:val="0"/>
+          <w:color w:val="A8261B"/>
+          <w:sz w:val="23"/>
+        </w:rPr>
+        <w:t>metrics</w:t>
+      </w:r>
+      <w:r>
+        <w:rPr>
+          <w:rFonts w:ascii="Calibri" w:hAnsi="Calibri" w:eastAsia="宋体" w:cs="Calibri"/>
+          <w:b w:val="0"/>
+          <w:i w:val="0"/>
+          <w:color w:val="241B17"/>
+          <w:sz w:val="24"/>
+        </w:rPr>
+        <w:t xml:space="preserve"> 为可选项，写了就会并入报告。</w:t>
+      </w:r>
+    </w:p>
+    <w:p>
+      <w:pPr>
+        <w:spacing w:before="0" w:after="160" w:line="360" w:lineRule="auto"/>
+        <w:ind w:firstLine="420"/>
+        <w:jc w:val="both"/>
+      </w:pPr>
+      <w:r>
+        <w:rPr>
+          <w:rFonts w:ascii="Consolas" w:hAnsi="Consolas" w:eastAsia="宋体" w:cs="Consolas"/>
+          <w:b w:val="0"/>
+          <w:i w:val="0"/>
+          <w:color w:val="A8261B"/>
+          <w:sz w:val="23"/>
+        </w:rPr>
+        <w:t>dataset</w:t>
+      </w:r>
+      <w:r>
+        <w:rPr>
+          <w:rFonts w:ascii="Calibri" w:hAnsi="Calibri" w:eastAsia="宋体" w:cs="Calibri"/>
+          <w:b w:val="0"/>
+          <w:i w:val="0"/>
+          <w:color w:val="241B17"/>
+          <w:sz w:val="24"/>
+        </w:rPr>
+        <w:t xml:space="preserve"> 中的字段建议与平台方协商后确定：字段缺失时报告只是留空，不会报错，因此容易到验收阶段才发现口径对不上。建议在 </w:t>
       </w:r>
       <w:r>
         <w:rPr>
@@ -15265,7 +15352,7 @@
           <w:color w:val="241B17"/>
           <w:sz w:val="24"/>
         </w:rPr>
-        <w:t xml:space="preserve"> 中写出该文件，使异常退出时也能留下可用的指标；进程非 0 退出时 </w:t>
+        <w:t xml:space="preserve"> 中写出该文件，使异常退出时也能留下可用的信息；进程非 0 退出时 </w:t>
       </w:r>
       <w:r>
         <w:rPr>

</xml_diff>

<commit_message>
docs(guide): clarify log naming, task scope and sample references
</commit_message>
<xml_diff>
--- a/docs/model-file-io-guide.docx
+++ b/docs/model-file-io-guide.docx
@@ -1221,7 +1221,7 @@
           <w:color w:val="6B5B54"/>
           <w:sz w:val="22"/>
         </w:rPr>
-        <w:t>3.5  步骤四：本地自检并上线</w:t>
+        <w:t>3.5  步骤四：本地自检并上传</w:t>
       </w:r>
     </w:p>
     <w:p>
@@ -1699,7 +1699,27 @@
           <w:color w:val="241B17"/>
           <w:sz w:val="24"/>
         </w:rPr>
-        <w:t>本手册适用于在 TAA 内执行的训练任务与推理任务。手册只覆盖文件读写约定；代码审计红线、任务阶段划分与产物导出口径不在本手册范围内。</w:t>
+        <w:t xml:space="preserve">本手册适用于在 TAA 内执行的训练任务；推理任务沿用同一套目录与文件约定，结果汇总文件同样命名为 </w:t>
+      </w:r>
+      <w:r>
+        <w:rPr>
+          <w:rFonts w:ascii="Consolas" w:hAnsi="Consolas" w:eastAsia="宋体" w:cs="Consolas"/>
+          <w:b w:val="0"/>
+          <w:i w:val="0"/>
+          <w:color w:val="A8261B"/>
+          <w:sz w:val="23"/>
+        </w:rPr>
+        <w:t>training_result.json</w:t>
+      </w:r>
+      <w:r>
+        <w:rPr>
+          <w:rFonts w:ascii="Calibri" w:hAnsi="Calibri" w:eastAsia="宋体" w:cs="Calibri"/>
+          <w:b w:val="0"/>
+          <w:i w:val="0"/>
+          <w:color w:val="241B17"/>
+          <w:sz w:val="24"/>
+        </w:rPr>
+        <w:t>。手册只覆盖文件读写约定；代码审计红线、任务阶段划分与产物导出口径不在本手册范围内。</w:t>
       </w:r>
     </w:p>
     <w:p>
@@ -2439,6 +2459,16 @@
             <w:pPr>
               <w:spacing w:before="0" w:after="0" w:line="312" w:lineRule="auto"/>
             </w:pPr>
+            <w:r>
+              <w:rPr>
+                <w:rFonts w:ascii="Calibri" w:hAnsi="Calibri" w:eastAsia="宋体" w:cs="Calibri"/>
+                <w:b w:val="0"/>
+                <w:i w:val="0"/>
+                <w:color w:val="241B17"/>
+                <w:sz w:val="21"/>
+              </w:rPr>
+              <w:t>模型权重（示例）</w:t>
+            </w:r>
           </w:p>
         </w:tc>
       </w:tr>
@@ -2474,6 +2504,16 @@
             <w:pPr>
               <w:spacing w:before="0" w:after="0" w:line="312" w:lineRule="auto"/>
             </w:pPr>
+            <w:r>
+              <w:rPr>
+                <w:rFonts w:ascii="Calibri" w:hAnsi="Calibri" w:eastAsia="宋体" w:cs="Calibri"/>
+                <w:b w:val="0"/>
+                <w:i w:val="0"/>
+                <w:color w:val="241B17"/>
+                <w:sz w:val="21"/>
+              </w:rPr>
+              <w:t>结果汇总文件，见第 6 章</w:t>
+            </w:r>
           </w:p>
         </w:tc>
       </w:tr>
@@ -2509,6 +2549,16 @@
             <w:pPr>
               <w:spacing w:before="0" w:after="0" w:line="312" w:lineRule="auto"/>
             </w:pPr>
+            <w:r>
+              <w:rPr>
+                <w:rFonts w:ascii="Calibri" w:hAnsi="Calibri" w:eastAsia="宋体" w:cs="Calibri"/>
+                <w:b w:val="0"/>
+                <w:i w:val="0"/>
+                <w:color w:val="241B17"/>
+                <w:sz w:val="21"/>
+              </w:rPr>
+              <w:t>测试结果（示例）</w:t>
+            </w:r>
           </w:p>
         </w:tc>
       </w:tr>
@@ -2552,7 +2602,7 @@
                 <w:color w:val="241B17"/>
                 <w:sz w:val="21"/>
               </w:rPr>
-              <w:t>以上为示例，按实际交付内容增删</w:t>
+              <w:t>按实际交付内容增删</w:t>
             </w:r>
           </w:p>
         </w:tc>
@@ -4097,7 +4147,7 @@
                 <w:color w:val="241B17"/>
                 <w:sz w:val="21"/>
               </w:rPr>
-              <w:t>本地自检并上线</w:t>
+              <w:t>本地自检并上传</w:t>
             </w:r>
           </w:p>
         </w:tc>
@@ -5073,7 +5123,7 @@
           <w:color w:val="A8261B"/>
           <w:sz w:val="30"/>
         </w:rPr>
-        <w:t>3.5  步骤四：本地自检并上线</w:t>
+        <w:t>3.5  步骤四：本地自检并上传</w:t>
       </w:r>
     </w:p>
     <w:p>
@@ -5090,7 +5140,7 @@
           <w:color w:val="241B17"/>
           <w:sz w:val="24"/>
         </w:rPr>
-        <w:t>改造完成后，先在普通环境用临时目录完整跑一遍，确认三个文件都按预期生成、内容可以正常解析；随后按第 9 章的检查清单逐项确认，再提交上线。</w:t>
+        <w:t>改造完成后，先在普通环境用临时目录完整跑一遍，确认三个文件都按预期生成、内容可以正常解析；随后按第 9 章的检查清单逐项确认，再提交上传。</w:t>
       </w:r>
     </w:p>
     <w:p>
@@ -5162,7 +5212,7 @@
           <w:color w:val="241B17"/>
           <w:sz w:val="24"/>
         </w:rPr>
-        <w:t xml:space="preserve"> 下。目录下的所有 </w:t>
+        <w:t xml:space="preserve"> 下。文件名不限，后缀为 </w:t>
       </w:r>
       <w:r>
         <w:rPr>
@@ -5182,7 +5232,7 @@
           <w:color w:val="241B17"/>
           <w:sz w:val="24"/>
         </w:rPr>
-        <w:t xml:space="preserve"> 与 </w:t>
+        <w:t xml:space="preserve"> 或 </w:t>
       </w:r>
       <w:r>
         <w:rPr>
@@ -5202,7 +5252,7 @@
           <w:color w:val="241B17"/>
           <w:sz w:val="24"/>
         </w:rPr>
-        <w:t xml:space="preserve"> 文件都会被读取，可以按阶段拆成多个文件。</w:t>
+        <w:t xml:space="preserve"> 就会被读取（后缀不区分大小写），可以按阶段拆成多个文件。子目录不会被扫描，日志请直接放在该目录下。多个文件按文件名排序后读取，平台上的展示先后顺序与文件名一致。</w:t>
       </w:r>
     </w:p>
     <w:p>
@@ -19284,6 +19334,103 @@
           <w:color w:val="241B17"/>
           <w:sz w:val="4"/>
         </w:rPr>
+      </w:r>
+    </w:p>
+    <w:p>
+      <w:pPr>
+        <w:spacing w:before="0" w:after="160" w:line="360" w:lineRule="auto"/>
+        <w:ind w:firstLine="420"/>
+        <w:jc w:val="both"/>
+      </w:pPr>
+      <w:r>
+        <w:rPr>
+          <w:rFonts w:ascii="Calibri" w:hAnsi="Calibri" w:eastAsia="宋体" w:cs="Calibri"/>
+          <w:b w:val="0"/>
+          <w:i w:val="0"/>
+          <w:color w:val="241B17"/>
+          <w:sz w:val="24"/>
+        </w:rPr>
+        <w:t xml:space="preserve">其中 </w:t>
+      </w:r>
+      <w:r>
+        <w:rPr>
+          <w:rFonts w:ascii="Consolas" w:hAnsi="Consolas" w:eastAsia="宋体" w:cs="Consolas"/>
+          <w:b w:val="0"/>
+          <w:i w:val="0"/>
+          <w:color w:val="A8261B"/>
+          <w:sz w:val="23"/>
+        </w:rPr>
+        <w:t>ModelLogger</w:t>
+      </w:r>
+      <w:r>
+        <w:rPr>
+          <w:rFonts w:ascii="Calibri" w:hAnsi="Calibri" w:eastAsia="宋体" w:cs="Calibri"/>
+          <w:b w:val="0"/>
+          <w:i w:val="0"/>
+          <w:color w:val="241B17"/>
+          <w:sz w:val="24"/>
+        </w:rPr>
+        <w:t xml:space="preserve"> 见示例 4-1，</w:t>
+      </w:r>
+      <w:r>
+        <w:rPr>
+          <w:rFonts w:ascii="Consolas" w:hAnsi="Consolas" w:eastAsia="宋体" w:cs="Consolas"/>
+          <w:b w:val="0"/>
+          <w:i w:val="0"/>
+          <w:color w:val="A8261B"/>
+          <w:sz w:val="23"/>
+        </w:rPr>
+        <w:t>ProgressTracker</w:t>
+      </w:r>
+      <w:r>
+        <w:rPr>
+          <w:rFonts w:ascii="Calibri" w:hAnsi="Calibri" w:eastAsia="宋体" w:cs="Calibri"/>
+          <w:b w:val="0"/>
+          <w:i w:val="0"/>
+          <w:color w:val="241B17"/>
+          <w:sz w:val="24"/>
+        </w:rPr>
+        <w:t xml:space="preserve"> 见示例 5-1；</w:t>
+      </w:r>
+      <w:r>
+        <w:rPr>
+          <w:rFonts w:ascii="Consolas" w:hAnsi="Consolas" w:eastAsia="宋体" w:cs="Consolas"/>
+          <w:b w:val="0"/>
+          <w:i w:val="0"/>
+          <w:color w:val="A8261B"/>
+          <w:sz w:val="23"/>
+        </w:rPr>
+        <w:t>build</w:t>
+      </w:r>
+      <w:r>
+        <w:rPr>
+          <w:rFonts w:ascii="Calibri" w:hAnsi="Calibri" w:eastAsia="宋体" w:cs="Calibri"/>
+          <w:b w:val="0"/>
+          <w:i w:val="0"/>
+          <w:color w:val="241B17"/>
+          <w:sz w:val="24"/>
+        </w:rPr>
+        <w:t xml:space="preserve"> 与 </w:t>
+      </w:r>
+      <w:r>
+        <w:rPr>
+          <w:rFonts w:ascii="Consolas" w:hAnsi="Consolas" w:eastAsia="宋体" w:cs="Consolas"/>
+          <w:b w:val="0"/>
+          <w:i w:val="0"/>
+          <w:color w:val="A8261B"/>
+          <w:sz w:val="23"/>
+        </w:rPr>
+        <w:t>run_epoch</w:t>
+      </w:r>
+      <w:r>
+        <w:rPr>
+          <w:rFonts w:ascii="Calibri" w:hAnsi="Calibri" w:eastAsia="宋体" w:cs="Calibri"/>
+          <w:b w:val="0"/>
+          <w:i w:val="0"/>
+          <w:color w:val="241B17"/>
+          <w:sz w:val="24"/>
+        </w:rPr>
+        <w:t xml:space="preserve"> 是需要自行实现的模型代码，此处仅为示意。</w:t>
       </w:r>
     </w:p>
     <w:sectPr>

</xml_diff>

<commit_message>
docs(guide): drop the file-name detail from the scope section
</commit_message>
<xml_diff>
--- a/docs/model-file-io-guide.docx
+++ b/docs/model-file-io-guide.docx
@@ -1699,27 +1699,7 @@
           <w:color w:val="241B17"/>
           <w:sz w:val="24"/>
         </w:rPr>
-        <w:t xml:space="preserve">本手册适用于在 TAA 内执行的训练任务；推理任务沿用同一套目录与文件约定，结果汇总文件同样命名为 </w:t>
-      </w:r>
-      <w:r>
-        <w:rPr>
-          <w:rFonts w:ascii="Consolas" w:hAnsi="Consolas" w:eastAsia="宋体" w:cs="Consolas"/>
-          <w:b w:val="0"/>
-          <w:i w:val="0"/>
-          <w:color w:val="A8261B"/>
-          <w:sz w:val="23"/>
-        </w:rPr>
-        <w:t>training_result.json</w:t>
-      </w:r>
-      <w:r>
-        <w:rPr>
-          <w:rFonts w:ascii="Calibri" w:hAnsi="Calibri" w:eastAsia="宋体" w:cs="Calibri"/>
-          <w:b w:val="0"/>
-          <w:i w:val="0"/>
-          <w:color w:val="241B17"/>
-          <w:sz w:val="24"/>
-        </w:rPr>
-        <w:t>。手册只覆盖文件读写约定；代码审计红线、任务阶段划分与产物导出口径不在本手册范围内。</w:t>
+        <w:t>本手册适用于在 TAA 内执行的训练任务；推理任务沿用同一套目录与文件约定。手册只覆盖文件读写约定；代码审计红线、任务阶段划分与产物导出口径不在本手册范围内。</w:t>
       </w:r>
     </w:p>
     <w:p>

</xml_diff>

<commit_message>
docs(guide): merge format and field sections in chapters 4 and 5
</commit_message>
<xml_diff>
--- a/docs/model-file-io-guide.docx
+++ b/docs/model-file-io-guide.docx
@@ -1269,7 +1269,7 @@
           <w:color w:val="6B5B54"/>
           <w:sz w:val="22"/>
         </w:rPr>
-        <w:t>4.2  格式要求</w:t>
+        <w:t>4.2  格式与字段</w:t>
       </w:r>
     </w:p>
     <w:p>
@@ -1285,7 +1285,7 @@
           <w:color w:val="6B5B54"/>
           <w:sz w:val="22"/>
         </w:rPr>
-        <w:t>4.3  字段说明</w:t>
+        <w:t>4.3  编写要求</w:t>
       </w:r>
     </w:p>
     <w:p>
@@ -1301,23 +1301,7 @@
           <w:color w:val="6B5B54"/>
           <w:sz w:val="22"/>
         </w:rPr>
-        <w:t>4.4  编写要求</w:t>
-      </w:r>
-    </w:p>
-    <w:p>
-      <w:pPr>
-        <w:spacing w:before="0" w:after="40" w:line="336" w:lineRule="auto"/>
-        <w:ind w:left="510"/>
-      </w:pPr>
-      <w:r>
-        <w:rPr>
-          <w:rFonts w:ascii="Calibri" w:hAnsi="Calibri" w:eastAsia="宋体" w:cs="Calibri"/>
-          <w:b w:val="0"/>
-          <w:i w:val="0"/>
-          <w:color w:val="6B5B54"/>
-          <w:sz w:val="22"/>
-        </w:rPr>
-        <w:t>4.5  参考实现</w:t>
+        <w:t>4.4  参考实现</w:t>
       </w:r>
     </w:p>
     <w:p>
@@ -1365,7 +1349,7 @@
           <w:color w:val="6B5B54"/>
           <w:sz w:val="22"/>
         </w:rPr>
-        <w:t>5.2  格式要求</w:t>
+        <w:t>5.2  格式与字段</w:t>
       </w:r>
     </w:p>
     <w:p>
@@ -1381,7 +1365,7 @@
           <w:color w:val="6B5B54"/>
           <w:sz w:val="22"/>
         </w:rPr>
-        <w:t>5.3  字段说明</w:t>
+        <w:t>5.3  写入要求</w:t>
       </w:r>
     </w:p>
     <w:p>
@@ -1397,7 +1381,7 @@
           <w:color w:val="6B5B54"/>
           <w:sz w:val="22"/>
         </w:rPr>
-        <w:t>5.4  写入要求</w:t>
+        <w:t>5.4  参考实现</w:t>
       </w:r>
     </w:p>
     <w:p>
@@ -1413,23 +1397,7 @@
           <w:color w:val="6B5B54"/>
           <w:sz w:val="22"/>
         </w:rPr>
-        <w:t>5.5  参考实现</w:t>
-      </w:r>
-    </w:p>
-    <w:p>
-      <w:pPr>
-        <w:spacing w:before="0" w:after="40" w:line="336" w:lineRule="auto"/>
-        <w:ind w:left="510"/>
-      </w:pPr>
-      <w:r>
-        <w:rPr>
-          <w:rFonts w:ascii="Calibri" w:hAnsi="Calibri" w:eastAsia="宋体" w:cs="Calibri"/>
-          <w:b w:val="0"/>
-          <w:i w:val="0"/>
-          <w:color w:val="6B5B54"/>
-          <w:sz w:val="22"/>
-        </w:rPr>
-        <w:t>5.6  进度预算建议</w:t>
+        <w:t>5.5  进度预算建议</w:t>
       </w:r>
     </w:p>
     <w:p>
@@ -5249,7 +5217,7 @@
           <w:color w:val="A8261B"/>
           <w:sz w:val="30"/>
         </w:rPr>
-        <w:t>4.2  格式要求</w:t>
+        <w:t>4.2  格式与字段</w:t>
       </w:r>
     </w:p>
     <w:p>
@@ -5487,23 +5455,6 @@
           <w:color w:val="241B17"/>
           <w:sz w:val="4"/>
         </w:rPr>
-      </w:r>
-    </w:p>
-    <w:p>
-      <w:pPr>
-        <w:pStyle w:val="Heading2"/>
-        <w:keepNext/>
-        <w:spacing w:before="280" w:after="120"/>
-      </w:pPr>
-      <w:r>
-        <w:rPr>
-          <w:rFonts w:ascii="微软雅黑" w:hAnsi="微软雅黑" w:eastAsia="微软雅黑" w:cs="微软雅黑"/>
-          <w:b/>
-          <w:i w:val="0"/>
-          <w:color w:val="A8261B"/>
-          <w:sz w:val="30"/>
-        </w:rPr>
-        <w:t>4.3  字段说明</w:t>
       </w:r>
     </w:p>
     <w:p>
@@ -5844,7 +5795,7 @@
           <w:color w:val="A8261B"/>
           <w:sz w:val="30"/>
         </w:rPr>
-        <w:t>4.4  编写要求</w:t>
+        <w:t>4.3  编写要求</w:t>
       </w:r>
     </w:p>
     <w:p>
@@ -5935,7 +5886,7 @@
           <w:color w:val="A8261B"/>
           <w:sz w:val="30"/>
         </w:rPr>
-        <w:t>4.5  参考实现</w:t>
+        <w:t>4.4  参考实现</w:t>
       </w:r>
     </w:p>
     <w:p>
@@ -8415,7 +8366,7 @@
           <w:color w:val="A8261B"/>
           <w:sz w:val="30"/>
         </w:rPr>
-        <w:t>5.2  格式要求</w:t>
+        <w:t>5.2  格式与字段</w:t>
       </w:r>
     </w:p>
     <w:tbl>
@@ -8674,23 +8625,6 @@
           <w:color w:val="241B17"/>
           <w:sz w:val="4"/>
         </w:rPr>
-      </w:r>
-    </w:p>
-    <w:p>
-      <w:pPr>
-        <w:pStyle w:val="Heading2"/>
-        <w:keepNext/>
-        <w:spacing w:before="280" w:after="120"/>
-      </w:pPr>
-      <w:r>
-        <w:rPr>
-          <w:rFonts w:ascii="微软雅黑" w:hAnsi="微软雅黑" w:eastAsia="微软雅黑" w:cs="微软雅黑"/>
-          <w:b/>
-          <w:i w:val="0"/>
-          <w:color w:val="A8261B"/>
-          <w:sz w:val="30"/>
-        </w:rPr>
-        <w:t>5.3  字段说明</w:t>
       </w:r>
     </w:p>
     <w:p>
@@ -9001,7 +8935,7 @@
           <w:color w:val="A8261B"/>
           <w:sz w:val="30"/>
         </w:rPr>
-        <w:t>5.4  写入要求</w:t>
+        <w:t>5.3  写入要求</w:t>
       </w:r>
     </w:p>
     <w:p>
@@ -9186,7 +9120,7 @@
           <w:color w:val="A8261B"/>
           <w:sz w:val="30"/>
         </w:rPr>
-        <w:t>5.5  参考实现</w:t>
+        <w:t>5.4  参考实现</w:t>
       </w:r>
     </w:p>
     <w:p>
@@ -13031,7 +12965,7 @@
           <w:color w:val="A8261B"/>
           <w:sz w:val="30"/>
         </w:rPr>
-        <w:t>5.6  进度预算建议</w:t>
+        <w:t>5.5  进度预算建议</w:t>
       </w:r>
     </w:p>
     <w:p>

</xml_diff>

<commit_message>
docs(guide): drop the negotiation advice from section 6.5
</commit_message>
<xml_diff>
--- a/docs/model-file-io-guide.docx
+++ b/docs/model-file-io-guide.docx
@@ -14758,23 +14758,13 @@
       </w:pPr>
       <w:r>
         <w:rPr>
-          <w:rFonts w:ascii="Consolas" w:hAnsi="Consolas" w:eastAsia="宋体" w:cs="Consolas"/>
-          <w:b w:val="0"/>
-          <w:i w:val="0"/>
-          <w:color w:val="A8261B"/>
-          <w:sz w:val="23"/>
-        </w:rPr>
-        <w:t>dataset</w:t>
-      </w:r>
-      <w:r>
-        <w:rPr>
           <w:rFonts w:ascii="Calibri" w:hAnsi="Calibri" w:eastAsia="宋体" w:cs="Calibri"/>
           <w:b w:val="0"/>
           <w:i w:val="0"/>
           <w:color w:val="241B17"/>
           <w:sz w:val="24"/>
         </w:rPr>
-        <w:t xml:space="preserve"> 中的字段建议与平台方协商后确定：字段缺失时报告只是留空，不会报错，因此容易到验收阶段才发现口径对不上。建议在 </w:t>
+        <w:t xml:space="preserve">字段缺失时报告只是留空，不会报错，因此容易到验收阶段才发现漏写。建议在 </w:t>
       </w:r>
       <w:r>
         <w:rPr>

</xml_diff>